<commit_message>
chore(eval): re-render on the merged model the folders that changed on master since serial lane 2 branched, part 04 (fb-595.54.82)
</commit_message>
<xml_diff>
--- a/courts/sixth-circuit/michigan/state/supreme-court/answering-brief/usage/OUTPUT-answering-brief.docx
+++ b/courts/sixth-circuit/michigan/state/supreme-court/answering-brief/usage/OUTPUT-answering-brief.docx
@@ -6321,7 +6321,7 @@
           <w:tab w:val="right" w:leader="dot" w:pos="9360"/>
         </w:tabs>
         <w:spacing w:before="96" w:after="0" w:line="276" w:lineRule="exact"/>
-        <w:ind w:left="720" w:right="1120" w:hanging="720"/>
+        <w:ind w:left="720" w:right="1200" w:hanging="720"/>
       </w:pPr>
       <w:r>
         <w:t xml:space="preserve">R</w:t>
@@ -6339,7 +6339,7 @@
         <w:tab/>
       </w:r>
       <w:r>
-        <w:t xml:space="preserve">7, 12, 13</w:t>
+        <w:t xml:space="preserve">7, 12, 13, 14</w:t>
       </w:r>
     </w:p>
     <w:p>
@@ -7584,7 +7584,7 @@
         <w:pStyle w:val="BodyText"/>
       </w:pPr>
       <w:r>
-        <w:t xml:space="preserve">The T&amp;C provided that if Ms. Davis had any “complaints, claims or disputes with regard to any alleged winnings . . . or the manner in which a game . . . is conducted,” she “must” —not may—“submit [her] complaint to [BetMGM]” and that if she was not satisfied with BetMGM’s response, she could pursue the dispute with the MGCB. T&amp;C, § 28 “Notices/​Complaints” (emphasis added) (App 27a). The T&amp;C also provided that:</w:t>
+        <w:t xml:space="preserve">The T&amp;C provided that if Ms. Davis had any “complaints, claims or disputes with regard to any alleged winnings ⁠. ⁠. ⁠. or the manner in which a game ⁠. ⁠. ⁠. is conducted,” she “must” —not may—“submit [her] complaint to [BetMGM]” and that if she was not satisfied with BetMGM’s response, she could pursue the dispute with the MGCB. T&amp;C, § 28 “Notices/​Complaints” (emphasis added) (App 27a). The T&amp;C also provided that:</w:t>
       </w:r>
     </w:p>
     <w:p>
@@ -7592,7 +7592,7 @@
         <w:pStyle w:val="XdQuoteOnly"/>
       </w:pPr>
       <w:r>
-        <w:t xml:space="preserve">If any amounts were credited to her Account due to any “error or . . . system failure or game error,” including “a divergence from the normal functioning of the game logic for whatever reason,” those amounts would be “null and void,”</w:t>
+        <w:t xml:space="preserve">If any amounts were credited to her Account due to any “error or ⁠. ⁠. ⁠. system failure or game error,” including “a divergence from the normal functioning of the game logic for whatever reason,” those amounts would be “null and void,”</w:t>
       </w:r>
       <w:r>
         <w:t xml:space="preserve"> </w:t>
@@ -7850,7 +7850,7 @@
         <w:pStyle w:val="BodyText"/>
       </w:pPr>
       <w:r>
-        <w:t xml:space="preserve">Ms. Davis’s breach of contract count alleged that BetMGM breached the T&amp;C by failing to allow her to withdraw her Account balance. Her fraud count alleged that “[b]y leaving the game on its platform . . . [BetMGM] was representing to Plaintiff . . . that Luck O’ the Roulette was a working game and was checked every day to ensure that it was functioning properly, and that it was on the platform in compliance with Michigan Rules.”</w:t>
+        <w:t xml:space="preserve">Ms. Davis’s breach of contract count alleged that BetMGM breached the T&amp;C by failing to allow her to withdraw her Account balance. Her fraud count alleged that “[b]y leaving the game on its platform ⁠. ⁠. ⁠. [BetMGM] was representing to Plaintiff ⁠. ⁠. ⁠. that Luck O’ the Roulette was a working game and was checked every day to ensure that it was functioning properly, and that it was on the platform in compliance with Michigan Rules.”</w:t>
       </w:r>
       <w:r>
         <w:t xml:space="preserve"> </w:t>
@@ -7866,7 +7866,7 @@
         <w:t xml:space="preserve"> </w:t>
       </w:r>
       <w:r>
-        <w:t xml:space="preserve">at ¶ 35 (App 97a). The conversion count alleged that “Plaintiff is entitled to . . . the amount reflected in her account balance . . . . [BetMGM] welched on the bets, is still in possession of Plaintiff’s winnings, and has refused to pay her what she is owed.”</w:t>
+        <w:t xml:space="preserve">at ¶ 35 (App 97a). The conversion count alleged that “Plaintiff is entitled to ⁠. ⁠. ⁠. the amount reflected in her account balance ⁠. ⁠. ⁠. ⁠. [BetMGM] welched on the bets, is still in possession of Plaintiff’s winnings, and has refused to pay her what she is owed.”</w:t>
       </w:r>
       <w:r>
         <w:t xml:space="preserve"> </w:t>
@@ -8113,7 +8113,7 @@
         <w:pStyle w:val="BodyText"/>
       </w:pPr>
       <w:r>
-        <w:t xml:space="preserve">On July 19, 2021, BetMGM filed its motion for summary disposition pursuant to MCR 2.116(C)⁠(4), asserting, inter alia, that “Plaintiff’s claims must be dismissed as they are preempted by the Lawful Internet Gaming Act . . . .” BetMGM Motion to Dismiss (App 102a). That argument was simply a textbook application of the well-established principle that:</w:t>
+        <w:t xml:space="preserve">On July 19, 2021, BetMGM filed its motion for summary disposition pursuant to MCR 2.116(C)⁠(4), asserting, inter alia, that “Plaintiff’s claims must be dismissed as they are preempted by the Lawful Internet Gaming Act ⁠. ⁠. ⁠. ⁠.” BetMGM Motion to Dismiss (App 102a). That argument was simply a textbook application of the well-established principle that:</w:t>
       </w:r>
     </w:p>
     <w:p>
@@ -8376,7 +8376,7 @@
         <w:pStyle w:val="BodyText"/>
       </w:pPr>
       <w:r>
-        <w:t xml:space="preserve">The Court of Appeals also rejected Ms. Davis’s argument that she was left without a forum: “[T]he MGCB . . . could have ordered . . . the reactivation of plaintiff’s account to allow her to withdraw the funds in dispute. That it may have declined to do so does not, however, leave plaintiff without a forum.”</w:t>
+        <w:t xml:space="preserve">The Court of Appeals also rejected Ms. Davis’s argument that she was left without a forum: “[T]he MGCB ⁠. ⁠. ⁠. could have ordered ⁠. ⁠. ⁠. the reactivation of plaintiff’s account to allow her to withdraw the funds in dispute. That it may have declined to do so does not, however, leave plaintiff without a forum.”</w:t>
       </w:r>
       <w:r>
         <w:t xml:space="preserve"> </w:t>
@@ -9212,7 +9212,7 @@
         <w:pStyle w:val="BodyText"/>
       </w:pPr>
       <w:r>
-        <w:t xml:space="preserve">“Jurisdictional questions under MCR 2.116(C)⁠(4) are questions of law that are . . . reviewed de novo.”</w:t>
+        <w:t xml:space="preserve">“Jurisdictional questions under MCR 2.116(C)⁠(4) are questions of law that are ⁠. ⁠. ⁠. reviewed de novo.”</w:t>
       </w:r>
       <w:r>
         <w:t xml:space="preserve"> </w:t>
@@ -10335,13 +10335,13 @@
         <w:t xml:space="preserve"> </w:t>
       </w:r>
       <w:r>
-        <w:t xml:space="preserve">makes it a misdemeanor to win at gambling: “Any person who by playing at cards, dice, or any other game, or by betting or putting up money on cards, or by any other means or device in the nature of betting on cards, or betting of any kind, wins or obtains any sum of money or any goods, or any article of value whatever, is guilty of a misdemeanor . . . .” Similarly, MCL § 750.301</w:t>
-      </w:r>
-      <w:r>
-        <w:t xml:space="preserve"> </w:t>
-      </w:r>
-      <w:r>
-        <w:t xml:space="preserve">makes it a misdemeanor to enter into a contract to accept payment from a person in return for the agreement that “any money or valuable thing” will be paid to that person “contingent upon the result of any race, contest, or game or upon the happening of any event not known by the parties . . . .”</w:t>
+        <w:t xml:space="preserve">makes it a misdemeanor to win at gambling: “Any person who by playing at cards, dice, or any other game, or by betting or putting up money on cards, or by any other means or device in the nature of betting on cards, or betting of any kind, wins or obtains any sum of money or any goods, or any article of value whatever, is guilty of a misdemeanor ⁠. ⁠. ⁠. ⁠.” Similarly, MCL § 750.301</w:t>
+      </w:r>
+      <w:r>
+        <w:t xml:space="preserve"> </w:t>
+      </w:r>
+      <w:r>
+        <w:t xml:space="preserve">makes it a misdemeanor to enter into a contract to accept payment from a person in return for the agreement that “any money or valuable thing” will be paid to that person “contingent upon the result of any race, contest, or game or upon the happening of any event not known by the parties ⁠. ⁠. ⁠. ⁠.”</w:t>
       </w:r>
       <w:r>
         <w:rPr>
@@ -11633,7 +11633,7 @@
         <w:t xml:space="preserve"> </w:t>
       </w:r>
       <w:r>
-        <w:t xml:space="preserve">In enacting LIGA, the Legislature mandated: “The [MGCB] has jurisdiction over and shall supervise all internet gaming operations governed by this act. The board may do anything necessary or desirable to effectuate this act . . . .” MCL § 432.309(1).</w:t>
+        <w:t xml:space="preserve">In enacting LIGA, the Legislature mandated: “The [MGCB] has jurisdiction over and shall supervise all internet gaming operations governed by this act. The board may do anything necessary or desirable to effectuate this act ⁠. ⁠. ⁠. ⁠.” MCL § 432.309(1).</w:t>
       </w:r>
     </w:p>
     <w:p>
@@ -11661,7 +11661,7 @@
         <w:t xml:space="preserve"> </w:t>
       </w:r>
       <w:r>
-        <w:t xml:space="preserve">Board duties, jurisdiction, and authority. . . .</w:t>
+        <w:t xml:space="preserve">Board duties, jurisdiction, and authority. ⁠. ⁠. ⁠.</w:t>
       </w:r>
     </w:p>
     <w:p>
@@ -11763,7 +11763,7 @@
         <w:pStyle w:val="BodyText"/>
       </w:pPr>
       <w:r>
-        <w:t xml:space="preserve">The Act directs the MGCB to promulgate a set of Rules that “may include any necessary and proper [rules] to govern internet gaming, including, but not limited to . . . [t]echnical and financial standards for internet wagering, internet wagering accounts, and internet gaming platforms, systems, and software or other electronic components integral to offering internet gaming.” MCL § 432.310(d).</w:t>
+        <w:t xml:space="preserve">The Act directs the MGCB to promulgate a set of Rules that “may include any necessary and proper [rules] to govern internet gaming, including, but not limited to ⁠. ⁠. ⁠. [t]echnical and financial standards for internet wagering, internet wagering accounts, and internet gaming platforms, systems, and software or other electronic components integral to offering internet gaming.” MCL § 432.310(d).</w:t>
       </w:r>
     </w:p>
     <w:p>
@@ -12175,7 +12175,7 @@
         <w:pStyle w:val="BodyText"/>
       </w:pPr>
       <w:r>
-        <w:t xml:space="preserve">For example, Rule 655d governs when an authorized participant must be allowed to withdraw the funds in an internet wagering account: “An authorized participant must be allowed to withdraw the funds maintained in his or her internet wagering account, whether the account is open or closed, except as otherwise provided in these rules . . . .” R 432.655d.</w:t>
+        <w:t xml:space="preserve">For example, Rule 655d governs when an authorized participant must be allowed to withdraw the funds in an internet wagering account: “An authorized participant must be allowed to withdraw the funds maintained in his or her internet wagering account, whether the account is open or closed, except as otherwise provided in these rules ⁠. ⁠. ⁠. ⁠.” R 432.655d.</w:t>
       </w:r>
       <w:r>
         <w:t xml:space="preserve"> </w:t>
@@ -12189,7 +12189,7 @@
         <w:pStyle w:val="BodyText"/>
       </w:pPr>
       <w:r>
-        <w:t xml:space="preserve">Rule 652 provides that: “All terms and conditions for internet wagering accounts must . . . address all aspects of the internet wagering, including . . . . Consent to the jurisdiction of this state to resolve any disputes arising out of internet wagering. . . . Notice that a malfunction voids all pays. . . . [And] [e]stimated time period for withdrawal of funds from an internet wagering account.” R 432.652(1);</w:t>
+        <w:t xml:space="preserve">Rule 652 provides that: “All terms and conditions for internet wagering accounts must ⁠. ⁠. ⁠. address all aspects of the internet wagering, including ⁠. ⁠. ⁠. ⁠. Consent to the jurisdiction of this state to resolve any disputes arising out of internet wagering. ⁠. ⁠. ⁠. Notice that a malfunction voids all pays. ⁠. ⁠. ⁠. [And] [e]stimated time period for withdrawal of funds from an internet wagering account.” R 432.652(1);</w:t>
       </w:r>
       <w:r>
         <w:t xml:space="preserve"> </w:t>
@@ -12573,7 +12573,7 @@
         <w:pStyle w:val="BodyText"/>
       </w:pPr>
       <w:r>
-        <w:t xml:space="preserve">The Rules specifically provide for procedures for handling disputes arising out of game play—including the dispute at issue in this matter—and empower the Board to regulate and conduct the patron dispute process. These are the rules that govern the disposition of patron complaints. That process requires the internet gaming operator or platform provider to advise participants of “their right to make a complaint against the internet gaming operator [or] the internet gaming platform provider . . . and how [to] submit a complaint to the [MGCB].” R 432.641(1)</w:t>
+        <w:t xml:space="preserve">The Rules specifically provide for procedures for handling disputes arising out of game play—including the dispute at issue in this matter—and empower the Board to regulate and conduct the patron dispute process. These are the rules that govern the disposition of patron complaints. That process requires the internet gaming operator or platform provider to advise participants of “their right to make a complaint against the internet gaming operator [or] the internet gaming platform provider ⁠. ⁠. ⁠. and how [to] submit a complaint to the [MGCB].” R 432.641(1)</w:t>
       </w:r>
       <w:r>
         <w:t xml:space="preserve"> </w:t>
@@ -13247,7 +13247,7 @@
         <w:t xml:space="preserve"> </w:t>
       </w:r>
       <w:r>
-        <w:t xml:space="preserve">at 114 n 3, but rejected that interpretation because there was no existing applicable common law at the time PERA was enacted: “Such construction need not be entertained here. There was no precedent for the proposed action under the common law at the time the PERA was enacted . . . . Nor may such cause be implied from the PERA.”</w:t>
+        <w:t xml:space="preserve">at 114 n 3, but rejected that interpretation because there was no existing applicable common law at the time PERA was enacted: “Such construction need not be entertained here. There was no precedent for the proposed action under the common law at the time the PERA was enacted ⁠. ⁠. ⁠. ⁠. Nor may such cause be implied from the PERA.”</w:t>
       </w:r>
       <w:r>
         <w:t xml:space="preserve"> </w:t>
@@ -13307,7 +13307,7 @@
         <w:t xml:space="preserve">In re Complaint of Rovas</w:t>
       </w:r>
       <w:r>
-        <w:t xml:space="preserve">, while an agency’s interpretation of what it is required or permitted to do under a statutory scheme is an “aid for discerning the Legislature’s intent,” its interpretation is “not binding on the courts” and “cannot conflict with the Legislature’s intent as expressed in the language of the statute . . . .” 482 Mich at 103.</w:t>
+        <w:t xml:space="preserve">, while an agency’s interpretation of what it is required or permitted to do under a statutory scheme is an “aid for discerning the Legislature’s intent,” its interpretation is “not binding on the courts” and “cannot conflict with the Legislature’s intent as expressed in the language of the statute ⁠. ⁠. ⁠. ⁠.” 482 Mich at 103.</w:t>
       </w:r>
       <w:r>
         <w:rPr>
@@ -13822,7 +13822,7 @@
         <w:t xml:space="preserve">Lamphere</w:t>
       </w:r>
       <w:r>
-        <w:t xml:space="preserve">, this Court noted that it was “convinced that the Legislature intended the PERA to occupy the public labor relations field completely . . . .” 400 Mich at 107. This Court considered the stated purposes of PERA, which provided:</w:t>
+        <w:t xml:space="preserve">, this Court noted that it was “convinced that the Legislature intended the PERA to occupy the public labor relations field completely ⁠. ⁠. ⁠. ⁠.” 400 Mich at 107. This Court considered the stated purposes of PERA, which provided:</w:t>
       </w:r>
     </w:p>
     <w:p>
@@ -13902,7 +13902,7 @@
         <w:pStyle w:val="XdQuoteOnly"/>
       </w:pPr>
       <w:r>
-        <w:t xml:space="preserve">The legislature finds and declares all of the following . . . Operating, conducting, and offering for play internet games over the internet involves gaming activity that already occurs throughout this state illegally. . . . In order to protect residents of this state who wager on games of chance or skill through the internet and to capture revenues generated from internet gaming, it is in the best interest of this state and its citizens to regulate this activity by establishing a secure, responsible, fair, and legal system of internet gaming.</w:t>
+        <w:t xml:space="preserve">The legislature finds and declares all of the following ⁠. ⁠. ⁠. Operating, conducting, and offering for play internet games over the internet involves gaming activity that already occurs throughout this state illegally. ⁠. ⁠. ⁠. In order to protect residents of this state who wager on games of chance or skill through the internet and to capture revenues generated from internet gaming, it is in the best interest of this state and its citizens to regulate this activity by establishing a secure, responsible, fair, and legal system of internet gaming.</w:t>
       </w:r>
     </w:p>
     <w:p>
@@ -15372,13 +15372,7 @@
         <w:t xml:space="preserve"> </w:t>
       </w:r>
       <w:r>
-        <w:t xml:space="preserve">Indeed, Ms. Davis claims that she elected to forgo sleep while she continued to play for several days straight as her account balance increased, demonstrating that she suspected that the funds were appearing in her account due to an error. The Court can take judicial notice pursuant to MRE 201 of a June 22, 2021 article that reports Ms. Davis played for five days straight. (Available at https://​www.​fox2detroit.​com/​news/​detroit-​woman-​says-​mgm-​wont-​pay</w:t>
-      </w:r>
-      <w:r>
-        <w:noBreakHyphen/>
-      </w:r>
-      <w:r>
-        <w:t xml:space="preserve">3-​million-​she-​won-​in-​online-​game-​due-​to-​glitch.)</w:t>
+        <w:t xml:space="preserve">Indeed, Ms. Davis claims that she elected to forgo sleep while she continued to play for several days straight as her account balance increased, demonstrating that she suspected that the funds were appearing in her account due to an error. The Court can take judicial notice pursuant to MRE 201 of a June 22, 2021 article that reports Ms. Davis played for five days straight. (Available at https://​www.​fox2detroit.​com/​news/​detroit-​woman-​says-​mgm-​wont-​pay-⁠3-​million-​she-​won-​in-​online-​game-​due-​to-​glitch.)</w:t>
       </w:r>
     </w:p>
   </w:footnote>
@@ -15506,7 +15500,7 @@
         <w:t xml:space="preserve">LLC</w:t>
       </w:r>
       <w:r>
-        <w:t xml:space="preserve">, 295 Mich App 25, 28; 811 NW2d 98 (2011)) (“One example of an exception created by the Legislature is the Gaming Act, which governs legalized non-Indian casino gambling in Detroit. . . . [I]f an exception does not apply, gambling debts are unenforceable in our courts.”).</w:t>
+        <w:t xml:space="preserve">, 295 Mich App 25, 28; 811 NW2d 98 (2011)) (“One example of an exception created by the Legislature is the Gaming Act, which governs legalized non-Indian casino gambling in Detroit. ⁠. ⁠. ⁠. [I]f an exception does not apply, gambling debts are unenforceable in our courts.”).</w:t>
       </w:r>
     </w:p>
   </w:footnote>
@@ -15612,7 +15606,7 @@
         <w:t xml:space="preserve"> </w:t>
       </w:r>
       <w:r>
-        <w:t xml:space="preserve">Any https://​www.​dictionary.​com/​browse/​any (accessed February 11, 2025) (“any . . . one, a, an, or some . . . .”).</w:t>
+        <w:t xml:space="preserve">Any https://​www.​dictionary.​com/​browse/​any (accessed February 11, 2025) (“any ⁠. ⁠. ⁠. one, a, an, or some ⁠. ⁠. ⁠. ⁠.”).</w:t>
       </w:r>
     </w:p>
   </w:footnote>
@@ -15878,7 +15872,7 @@
           <w:i/>
           <w:iCs/>
         </w:rPr>
-        <w:t xml:space="preserve">Fultz v Union-⁠Commerce Assoc</w:t>
+        <w:t xml:space="preserve">Fultz v Union-Commerce Assoc</w:t>
       </w:r>
       <w:r>
         <w:t xml:space="preserve">, 470 Mich 460, 466; 683 NW2d 587 (2004) (citing</w:t>
@@ -15920,7 +15914,7 @@
           <w:i/>
           <w:iCs/>
         </w:rPr>
-        <w:t xml:space="preserve">Llewellyn-⁠Jones v Metro Prop Group,</w:t>
+        <w:t xml:space="preserve">Llewellyn-Jones v Metro Prop Group,</w:t>
       </w:r>
       <w:r>
         <w:rPr>

</xml_diff>

<commit_message>
mich supreme court third pass: answering-brief gated (latex passes with the § note kept; docx_bias 0.05 for Word's note 1, docx reported for Word's note placement), petition-for-writ and reply-brief docx gated; brief-on-the-merits and petition-for-rehearing still reported (fb-595.54.31)
Co-Authored-By: Claude Opus 5.5 <noreply@anthropic.com>
</commit_message>
<xml_diff>
--- a/courts/sixth-circuit/michigan/state/supreme-court/answering-brief/usage/OUTPUT-answering-brief.docx
+++ b/courts/sixth-circuit/michigan/state/supreme-court/answering-brief/usage/OUTPUT-answering-brief.docx
@@ -397,7 +397,7 @@
     </w:p>
     <w:tbl>
       <w:tblPr>
-        <w:tblW w:w="9360" w:type="dxa"/>
+        <w:tblW w:w="9359" w:type="dxa"/>
         <w:tblLayout w:type="fixed"/>
         <w:tblCellMar>
           <w:top w:w="0" w:type="dxa"/>
@@ -408,7 +408,7 @@
         <w:tblLook w:val="0000" w:firstRow="0" w:lastRow="0" w:firstColumn="0" w:lastColumn="0" w:noHBand="0" w:noVBand="0"/>
       </w:tblPr>
       <w:tblGrid>
-        <w:gridCol w:w="4464"/>
+        <w:gridCol w:w="4463"/>
         <w:gridCol w:w="4896"/>
       </w:tblGrid>
       <w:tr>
@@ -417,7 +417,7 @@
         </w:trPr>
         <w:tc>
           <w:tcPr>
-            <w:tcW w:w="4464" w:type="dxa"/>
+            <w:tcW w:w="4463" w:type="dxa"/>
           </w:tcPr>
           <w:p>
             <w:pPr>
@@ -785,7 +785,7 @@
     </w:p>
     <w:tbl>
       <w:tblPr>
-        <w:tblW w:w="9360" w:type="dxa"/>
+        <w:tblW w:w="9359" w:type="dxa"/>
         <w:tblLayout w:type="fixed"/>
         <w:tblCellMar>
           <w:top w:w="0" w:type="dxa"/>
@@ -796,7 +796,7 @@
         <w:tblLook w:val="0000" w:firstRow="0" w:lastRow="0" w:firstColumn="0" w:lastColumn="0" w:noHBand="0" w:noVBand="0"/>
       </w:tblPr>
       <w:tblGrid>
-        <w:gridCol w:w="4464"/>
+        <w:gridCol w:w="4463"/>
         <w:gridCol w:w="4896"/>
       </w:tblGrid>
       <w:tr>
@@ -805,7 +805,7 @@
         </w:trPr>
         <w:tc>
           <w:tcPr>
-            <w:tcW w:w="4464" w:type="dxa"/>
+            <w:tcW w:w="4463" w:type="dxa"/>
           </w:tcPr>
           <w:p>
             <w:pPr>
@@ -1226,7 +1226,7 @@
         <w:sectPr>
           <w:footerReference w:type="default" r:id="rIdXdNone"/>
           <w:pgSz w:w="12240" w:h="15840"/>
-          <w:pgMar w:top="1440" w:right="1440" w:bottom="1440" w:left="1440" w:header="720" w:footer="732" w:gutter="0"/>
+          <w:pgMar w:top="1440" w:right="1441" w:bottom="1440" w:left="1440" w:header="720" w:footer="732" w:gutter="0"/>
         </w:sectPr>
       </w:pPr>
     </w:p>
@@ -1278,7 +1278,7 @@
       <w:pPr>
         <w:keepLines/>
         <w:tabs>
-          <w:tab w:val="right" w:leader="dot" w:pos="9360"/>
+          <w:tab w:val="right" w:leader="dot" w:pos="9359"/>
         </w:tabs>
         <w:spacing w:before="144" w:after="0" w:line="276" w:lineRule="exact"/>
         <w:ind w:left="360" w:right="720" w:hanging="360"/>
@@ -1318,7 +1318,7 @@
       <w:pPr>
         <w:keepLines/>
         <w:tabs>
-          <w:tab w:val="right" w:leader="dot" w:pos="9360"/>
+          <w:tab w:val="right" w:leader="dot" w:pos="9359"/>
         </w:tabs>
         <w:spacing w:before="144" w:after="0" w:line="276" w:lineRule="exact"/>
         <w:ind w:left="360" w:right="720" w:hanging="360"/>
@@ -1352,7 +1352,7 @@
       <w:pPr>
         <w:keepLines/>
         <w:tabs>
-          <w:tab w:val="right" w:leader="dot" w:pos="9360"/>
+          <w:tab w:val="right" w:leader="dot" w:pos="9359"/>
         </w:tabs>
         <w:spacing w:before="144" w:after="0" w:line="276" w:lineRule="exact"/>
         <w:ind w:left="360" w:right="720" w:hanging="360"/>
@@ -1398,7 +1398,7 @@
       <w:pPr>
         <w:keepLines/>
         <w:tabs>
-          <w:tab w:val="right" w:leader="dot" w:pos="9360"/>
+          <w:tab w:val="right" w:leader="dot" w:pos="9359"/>
         </w:tabs>
         <w:spacing w:before="144" w:after="0" w:line="276" w:lineRule="exact"/>
         <w:ind w:left="360" w:right="720" w:hanging="360"/>
@@ -1432,7 +1432,7 @@
       <w:pPr>
         <w:keepLines/>
         <w:tabs>
-          <w:tab w:val="right" w:leader="dot" w:pos="9360"/>
+          <w:tab w:val="right" w:leader="dot" w:pos="9359"/>
         </w:tabs>
         <w:spacing w:before="144" w:after="0" w:line="276" w:lineRule="exact"/>
         <w:ind w:left="360" w:right="720" w:hanging="360"/>
@@ -1466,7 +1466,7 @@
       <w:pPr>
         <w:keepLines/>
         <w:tabs>
-          <w:tab w:val="right" w:leader="dot" w:pos="9360"/>
+          <w:tab w:val="right" w:leader="dot" w:pos="9359"/>
         </w:tabs>
         <w:spacing w:before="144" w:after="0" w:line="276" w:lineRule="exact"/>
         <w:ind w:left="720" w:right="720" w:hanging="360"/>
@@ -1518,7 +1518,7 @@
       <w:pPr>
         <w:keepLines/>
         <w:tabs>
-          <w:tab w:val="right" w:leader="dot" w:pos="9360"/>
+          <w:tab w:val="right" w:leader="dot" w:pos="9359"/>
         </w:tabs>
         <w:spacing w:before="144" w:after="0" w:line="276" w:lineRule="exact"/>
         <w:ind w:left="720" w:right="720" w:hanging="360"/>
@@ -1552,7 +1552,7 @@
       <w:pPr>
         <w:keepLines/>
         <w:tabs>
-          <w:tab w:val="right" w:leader="dot" w:pos="9360"/>
+          <w:tab w:val="right" w:leader="dot" w:pos="9359"/>
         </w:tabs>
         <w:spacing w:before="144" w:after="0" w:line="276" w:lineRule="exact"/>
         <w:ind w:left="720" w:right="720" w:hanging="360"/>
@@ -1610,7 +1610,7 @@
       <w:pPr>
         <w:keepLines/>
         <w:tabs>
-          <w:tab w:val="right" w:leader="dot" w:pos="9360"/>
+          <w:tab w:val="right" w:leader="dot" w:pos="9359"/>
         </w:tabs>
         <w:spacing w:before="144" w:after="0" w:line="276" w:lineRule="exact"/>
         <w:ind w:left="720" w:right="720" w:hanging="360"/>
@@ -1662,7 +1662,7 @@
       <w:pPr>
         <w:keepLines/>
         <w:tabs>
-          <w:tab w:val="right" w:leader="dot" w:pos="9360"/>
+          <w:tab w:val="right" w:leader="dot" w:pos="9359"/>
         </w:tabs>
         <w:spacing w:before="144" w:after="0" w:line="276" w:lineRule="exact"/>
         <w:ind w:left="720" w:right="720" w:hanging="360"/>
@@ -1726,7 +1726,7 @@
       <w:pPr>
         <w:keepLines/>
         <w:tabs>
-          <w:tab w:val="right" w:leader="dot" w:pos="9360"/>
+          <w:tab w:val="right" w:leader="dot" w:pos="9359"/>
         </w:tabs>
         <w:spacing w:before="144" w:after="0" w:line="276" w:lineRule="exact"/>
         <w:ind w:left="720" w:right="720" w:hanging="360"/>
@@ -1778,7 +1778,7 @@
       <w:pPr>
         <w:keepLines/>
         <w:tabs>
-          <w:tab w:val="right" w:leader="dot" w:pos="9360"/>
+          <w:tab w:val="right" w:leader="dot" w:pos="9359"/>
         </w:tabs>
         <w:spacing w:before="144" w:after="0" w:line="276" w:lineRule="exact"/>
         <w:ind w:left="360" w:right="720" w:hanging="360"/>
@@ -1800,7 +1800,7 @@
       <w:pPr>
         <w:keepLines/>
         <w:tabs>
-          <w:tab w:val="right" w:leader="dot" w:pos="9360"/>
+          <w:tab w:val="right" w:leader="dot" w:pos="9359"/>
         </w:tabs>
         <w:spacing w:before="144" w:after="0" w:line="276" w:lineRule="exact"/>
         <w:ind w:left="720" w:right="720" w:hanging="360"/>
@@ -2068,7 +2068,7 @@
       <w:pPr>
         <w:keepLines/>
         <w:tabs>
-          <w:tab w:val="right" w:leader="dot" w:pos="9360"/>
+          <w:tab w:val="right" w:leader="dot" w:pos="9359"/>
         </w:tabs>
         <w:spacing w:before="144" w:after="0" w:line="276" w:lineRule="exact"/>
         <w:ind w:left="360" w:right="720" w:hanging="360"/>
@@ -2174,7 +2174,7 @@
       <w:pPr>
         <w:keepLines/>
         <w:tabs>
-          <w:tab w:val="right" w:leader="dot" w:pos="9360"/>
+          <w:tab w:val="right" w:leader="dot" w:pos="9359"/>
         </w:tabs>
         <w:spacing w:before="96" w:after="0" w:line="276" w:lineRule="exact"/>
         <w:ind w:left="720" w:right="1120" w:hanging="720"/>
@@ -2301,7 +2301,7 @@
       <w:pPr>
         <w:keepLines/>
         <w:tabs>
-          <w:tab w:val="right" w:leader="dot" w:pos="9360"/>
+          <w:tab w:val="right" w:leader="dot" w:pos="9359"/>
         </w:tabs>
         <w:spacing w:before="96" w:after="0" w:line="276" w:lineRule="exact"/>
         <w:ind w:left="720" w:right="1120" w:hanging="720"/>
@@ -2456,7 +2456,7 @@
       <w:pPr>
         <w:keepLines/>
         <w:tabs>
-          <w:tab w:val="right" w:leader="dot" w:pos="9360"/>
+          <w:tab w:val="right" w:leader="dot" w:pos="9359"/>
         </w:tabs>
         <w:spacing w:before="96" w:after="0" w:line="276" w:lineRule="exact"/>
         <w:ind w:left="720" w:right="1120" w:hanging="720"/>
@@ -2561,7 +2561,7 @@
       <w:pPr>
         <w:keepLines/>
         <w:tabs>
-          <w:tab w:val="right" w:leader="dot" w:pos="9360"/>
+          <w:tab w:val="right" w:leader="dot" w:pos="9359"/>
         </w:tabs>
         <w:spacing w:before="96" w:after="0" w:line="276" w:lineRule="exact"/>
         <w:ind w:left="720" w:right="1120" w:hanging="720"/>
@@ -2710,7 +2710,7 @@
       <w:pPr>
         <w:keepLines/>
         <w:tabs>
-          <w:tab w:val="right" w:leader="dot" w:pos="9360"/>
+          <w:tab w:val="right" w:leader="dot" w:pos="9359"/>
         </w:tabs>
         <w:spacing w:before="96" w:after="0" w:line="276" w:lineRule="exact"/>
         <w:ind w:left="720" w:right="1120" w:hanging="720"/>
@@ -2829,7 +2829,7 @@
       <w:pPr>
         <w:keepLines/>
         <w:tabs>
-          <w:tab w:val="right" w:leader="dot" w:pos="9360"/>
+          <w:tab w:val="right" w:leader="dot" w:pos="9359"/>
         </w:tabs>
         <w:spacing w:before="96" w:after="0" w:line="276" w:lineRule="exact"/>
         <w:ind w:left="720" w:right="1120" w:hanging="720"/>
@@ -2942,7 +2942,7 @@
       <w:pPr>
         <w:keepLines/>
         <w:tabs>
-          <w:tab w:val="right" w:leader="dot" w:pos="9360"/>
+          <w:tab w:val="right" w:leader="dot" w:pos="9359"/>
         </w:tabs>
         <w:spacing w:before="96" w:after="0" w:line="276" w:lineRule="exact"/>
         <w:ind w:left="720" w:right="1120" w:hanging="720"/>
@@ -3041,7 +3041,7 @@
       <w:pPr>
         <w:keepLines/>
         <w:tabs>
-          <w:tab w:val="right" w:leader="dot" w:pos="9360"/>
+          <w:tab w:val="right" w:leader="dot" w:pos="9359"/>
         </w:tabs>
         <w:spacing w:before="96" w:after="0" w:line="276" w:lineRule="exact"/>
         <w:ind w:left="720" w:right="1120" w:hanging="720"/>
@@ -3140,7 +3140,7 @@
       <w:pPr>
         <w:keepLines/>
         <w:tabs>
-          <w:tab w:val="right" w:leader="dot" w:pos="9360"/>
+          <w:tab w:val="right" w:leader="dot" w:pos="9359"/>
         </w:tabs>
         <w:spacing w:before="96" w:after="0" w:line="276" w:lineRule="exact"/>
         <w:ind w:left="720" w:right="1120" w:hanging="720"/>
@@ -3239,7 +3239,7 @@
       <w:pPr>
         <w:keepLines/>
         <w:tabs>
-          <w:tab w:val="right" w:leader="dot" w:pos="9360"/>
+          <w:tab w:val="right" w:leader="dot" w:pos="9359"/>
         </w:tabs>
         <w:spacing w:before="96" w:after="0" w:line="276" w:lineRule="exact"/>
         <w:ind w:left="720" w:right="1120" w:hanging="720"/>
@@ -3380,7 +3380,7 @@
       <w:pPr>
         <w:keepLines/>
         <w:tabs>
-          <w:tab w:val="right" w:leader="dot" w:pos="9360"/>
+          <w:tab w:val="right" w:leader="dot" w:pos="9359"/>
         </w:tabs>
         <w:spacing w:before="96" w:after="0" w:line="276" w:lineRule="exact"/>
         <w:ind w:left="720" w:right="1120" w:hanging="720"/>
@@ -3549,7 +3549,7 @@
       <w:pPr>
         <w:keepLines/>
         <w:tabs>
-          <w:tab w:val="right" w:leader="dot" w:pos="9360"/>
+          <w:tab w:val="right" w:leader="dot" w:pos="9359"/>
         </w:tabs>
         <w:spacing w:before="96" w:after="0" w:line="276" w:lineRule="exact"/>
         <w:ind w:left="720" w:right="1120" w:hanging="720"/>
@@ -3696,7 +3696,7 @@
       <w:pPr>
         <w:keepLines/>
         <w:tabs>
-          <w:tab w:val="right" w:leader="dot" w:pos="9360"/>
+          <w:tab w:val="right" w:leader="dot" w:pos="9359"/>
         </w:tabs>
         <w:spacing w:before="96" w:after="0" w:line="276" w:lineRule="exact"/>
         <w:ind w:left="720" w:right="1120" w:hanging="720"/>
@@ -3825,7 +3825,7 @@
       <w:pPr>
         <w:keepLines/>
         <w:tabs>
-          <w:tab w:val="right" w:leader="dot" w:pos="9360"/>
+          <w:tab w:val="right" w:leader="dot" w:pos="9359"/>
         </w:tabs>
         <w:spacing w:before="96" w:after="0" w:line="276" w:lineRule="exact"/>
         <w:ind w:left="720" w:right="1120" w:hanging="720"/>
@@ -3958,7 +3958,7 @@
       <w:pPr>
         <w:keepLines/>
         <w:tabs>
-          <w:tab w:val="right" w:leader="dot" w:pos="9360"/>
+          <w:tab w:val="right" w:leader="dot" w:pos="9359"/>
         </w:tabs>
         <w:spacing w:before="96" w:after="0" w:line="276" w:lineRule="exact"/>
         <w:ind w:left="720" w:right="1120" w:hanging="720"/>
@@ -4113,7 +4113,7 @@
       <w:pPr>
         <w:keepLines/>
         <w:tabs>
-          <w:tab w:val="right" w:leader="dot" w:pos="9360"/>
+          <w:tab w:val="right" w:leader="dot" w:pos="9359"/>
         </w:tabs>
         <w:spacing w:before="96" w:after="0" w:line="276" w:lineRule="exact"/>
         <w:ind w:left="720" w:right="1120" w:hanging="720"/>
@@ -4212,7 +4212,7 @@
       <w:pPr>
         <w:keepLines/>
         <w:tabs>
-          <w:tab w:val="right" w:leader="dot" w:pos="9360"/>
+          <w:tab w:val="right" w:leader="dot" w:pos="9359"/>
         </w:tabs>
         <w:spacing w:before="96" w:after="0" w:line="276" w:lineRule="exact"/>
         <w:ind w:left="720" w:right="1120" w:hanging="720"/>
@@ -4359,7 +4359,7 @@
       <w:pPr>
         <w:keepLines/>
         <w:tabs>
-          <w:tab w:val="right" w:leader="dot" w:pos="9360"/>
+          <w:tab w:val="right" w:leader="dot" w:pos="9359"/>
         </w:tabs>
         <w:spacing w:before="96" w:after="0" w:line="276" w:lineRule="exact"/>
         <w:ind w:left="720" w:right="1120" w:hanging="720"/>
@@ -4458,7 +4458,7 @@
       <w:pPr>
         <w:keepLines/>
         <w:tabs>
-          <w:tab w:val="right" w:leader="dot" w:pos="9360"/>
+          <w:tab w:val="right" w:leader="dot" w:pos="9359"/>
         </w:tabs>
         <w:spacing w:before="96" w:after="0" w:line="276" w:lineRule="exact"/>
         <w:ind w:left="720" w:right="1120" w:hanging="720"/>
@@ -4599,7 +4599,7 @@
       <w:pPr>
         <w:keepLines/>
         <w:tabs>
-          <w:tab w:val="right" w:leader="dot" w:pos="9360"/>
+          <w:tab w:val="right" w:leader="dot" w:pos="9359"/>
         </w:tabs>
         <w:spacing w:before="96" w:after="0" w:line="276" w:lineRule="exact"/>
         <w:ind w:left="720" w:right="1120" w:hanging="720"/>
@@ -4732,7 +4732,7 @@
       <w:pPr>
         <w:keepLines/>
         <w:tabs>
-          <w:tab w:val="right" w:leader="dot" w:pos="9360"/>
+          <w:tab w:val="right" w:leader="dot" w:pos="9359"/>
         </w:tabs>
         <w:spacing w:before="96" w:after="0" w:line="276" w:lineRule="exact"/>
         <w:ind w:left="720" w:right="1120" w:hanging="720"/>
@@ -4831,7 +4831,7 @@
       <w:pPr>
         <w:keepLines/>
         <w:tabs>
-          <w:tab w:val="right" w:leader="dot" w:pos="9360"/>
+          <w:tab w:val="right" w:leader="dot" w:pos="9359"/>
         </w:tabs>
         <w:spacing w:before="96" w:after="0" w:line="276" w:lineRule="exact"/>
         <w:ind w:left="720" w:right="1120" w:hanging="720"/>
@@ -4936,7 +4936,7 @@
       <w:pPr>
         <w:keepLines/>
         <w:tabs>
-          <w:tab w:val="right" w:leader="dot" w:pos="9360"/>
+          <w:tab w:val="right" w:leader="dot" w:pos="9359"/>
         </w:tabs>
         <w:spacing w:before="96" w:after="0" w:line="276" w:lineRule="exact"/>
         <w:ind w:left="720" w:right="1120" w:hanging="720"/>
@@ -5063,7 +5063,7 @@
       <w:pPr>
         <w:keepLines/>
         <w:tabs>
-          <w:tab w:val="right" w:leader="dot" w:pos="9360"/>
+          <w:tab w:val="right" w:leader="dot" w:pos="9359"/>
         </w:tabs>
         <w:spacing w:before="96" w:after="0" w:line="276" w:lineRule="exact"/>
         <w:ind w:left="720" w:right="1120" w:hanging="720"/>
@@ -5162,7 +5162,7 @@
       <w:pPr>
         <w:keepLines/>
         <w:tabs>
-          <w:tab w:val="right" w:leader="dot" w:pos="9360"/>
+          <w:tab w:val="right" w:leader="dot" w:pos="9359"/>
         </w:tabs>
         <w:spacing w:before="96" w:after="0" w:line="276" w:lineRule="exact"/>
         <w:ind w:left="720" w:right="1120" w:hanging="720"/>
@@ -5261,7 +5261,7 @@
       <w:pPr>
         <w:keepLines/>
         <w:tabs>
-          <w:tab w:val="right" w:leader="dot" w:pos="9360"/>
+          <w:tab w:val="right" w:leader="dot" w:pos="9359"/>
         </w:tabs>
         <w:spacing w:before="96" w:after="0" w:line="276" w:lineRule="exact"/>
         <w:ind w:left="720" w:right="1120" w:hanging="720"/>
@@ -5366,7 +5366,7 @@
       <w:pPr>
         <w:keepLines/>
         <w:tabs>
-          <w:tab w:val="right" w:leader="dot" w:pos="9360"/>
+          <w:tab w:val="right" w:leader="dot" w:pos="9359"/>
         </w:tabs>
         <w:spacing w:before="96" w:after="0" w:line="276" w:lineRule="exact"/>
         <w:ind w:left="720" w:right="1120" w:hanging="720"/>
@@ -5487,7 +5487,7 @@
       <w:pPr>
         <w:keepLines/>
         <w:tabs>
-          <w:tab w:val="right" w:leader="dot" w:pos="9360"/>
+          <w:tab w:val="right" w:leader="dot" w:pos="9359"/>
         </w:tabs>
         <w:spacing w:before="96" w:after="0" w:line="276" w:lineRule="exact"/>
         <w:ind w:left="720" w:right="1120" w:hanging="720"/>
@@ -5648,7 +5648,7 @@
       <w:pPr>
         <w:keepLines/>
         <w:tabs>
-          <w:tab w:val="right" w:leader="dot" w:pos="9360"/>
+          <w:tab w:val="right" w:leader="dot" w:pos="9359"/>
         </w:tabs>
         <w:spacing w:before="96" w:after="0" w:line="276" w:lineRule="exact"/>
         <w:ind w:left="720" w:right="1120" w:hanging="720"/>
@@ -5775,7 +5775,7 @@
       <w:pPr>
         <w:keepLines/>
         <w:tabs>
-          <w:tab w:val="right" w:leader="dot" w:pos="9360"/>
+          <w:tab w:val="right" w:leader="dot" w:pos="9359"/>
         </w:tabs>
         <w:spacing w:before="96" w:after="0" w:line="276" w:lineRule="exact"/>
         <w:ind w:left="720" w:right="1120" w:hanging="720"/>
@@ -5944,7 +5944,7 @@
       <w:pPr>
         <w:keepLines/>
         <w:tabs>
-          <w:tab w:val="right" w:leader="dot" w:pos="9360"/>
+          <w:tab w:val="right" w:leader="dot" w:pos="9359"/>
         </w:tabs>
         <w:spacing w:before="96" w:after="0" w:line="276" w:lineRule="exact"/>
         <w:ind w:left="720" w:right="1120" w:hanging="720"/>
@@ -5978,7 +5978,7 @@
       <w:pPr>
         <w:keepLines/>
         <w:tabs>
-          <w:tab w:val="right" w:leader="dot" w:pos="9360"/>
+          <w:tab w:val="right" w:leader="dot" w:pos="9359"/>
         </w:tabs>
         <w:spacing w:before="96" w:after="0" w:line="276" w:lineRule="exact"/>
         <w:ind w:left="720" w:right="1120" w:hanging="720"/>
@@ -6012,7 +6012,7 @@
       <w:pPr>
         <w:keepLines/>
         <w:tabs>
-          <w:tab w:val="right" w:leader="dot" w:pos="9360"/>
+          <w:tab w:val="right" w:leader="dot" w:pos="9359"/>
         </w:tabs>
         <w:spacing w:before="96" w:after="0" w:line="276" w:lineRule="exact"/>
         <w:ind w:left="720" w:right="1120" w:hanging="720"/>
@@ -6046,7 +6046,7 @@
       <w:pPr>
         <w:keepLines/>
         <w:tabs>
-          <w:tab w:val="right" w:leader="dot" w:pos="9360"/>
+          <w:tab w:val="right" w:leader="dot" w:pos="9359"/>
         </w:tabs>
         <w:spacing w:before="96" w:after="0" w:line="276" w:lineRule="exact"/>
         <w:ind w:left="720" w:right="1120" w:hanging="720"/>
@@ -6080,7 +6080,7 @@
       <w:pPr>
         <w:keepLines/>
         <w:tabs>
-          <w:tab w:val="right" w:leader="dot" w:pos="9360"/>
+          <w:tab w:val="right" w:leader="dot" w:pos="9359"/>
         </w:tabs>
         <w:spacing w:before="96" w:after="0" w:line="276" w:lineRule="exact"/>
         <w:ind w:left="720" w:right="1120" w:hanging="720"/>
@@ -6114,7 +6114,7 @@
       <w:pPr>
         <w:keepLines/>
         <w:tabs>
-          <w:tab w:val="right" w:leader="dot" w:pos="9360"/>
+          <w:tab w:val="right" w:leader="dot" w:pos="9359"/>
         </w:tabs>
         <w:spacing w:before="96" w:after="0" w:line="276" w:lineRule="exact"/>
         <w:ind w:left="720" w:right="1120" w:hanging="720"/>
@@ -6148,7 +6148,7 @@
       <w:pPr>
         <w:keepLines/>
         <w:tabs>
-          <w:tab w:val="right" w:leader="dot" w:pos="9360"/>
+          <w:tab w:val="right" w:leader="dot" w:pos="9359"/>
         </w:tabs>
         <w:spacing w:before="96" w:after="0" w:line="276" w:lineRule="exact"/>
         <w:ind w:left="720" w:right="1120" w:hanging="720"/>
@@ -6182,7 +6182,7 @@
       <w:pPr>
         <w:keepLines/>
         <w:tabs>
-          <w:tab w:val="right" w:leader="dot" w:pos="9360"/>
+          <w:tab w:val="right" w:leader="dot" w:pos="9359"/>
         </w:tabs>
         <w:spacing w:before="96" w:after="0" w:line="276" w:lineRule="exact"/>
         <w:ind w:left="720" w:right="1120" w:hanging="720"/>
@@ -6216,7 +6216,7 @@
       <w:pPr>
         <w:keepLines/>
         <w:tabs>
-          <w:tab w:val="right" w:leader="dot" w:pos="9360"/>
+          <w:tab w:val="right" w:leader="dot" w:pos="9359"/>
         </w:tabs>
         <w:spacing w:before="96" w:after="0" w:line="276" w:lineRule="exact"/>
         <w:ind w:left="720" w:right="1120" w:hanging="720"/>
@@ -6250,7 +6250,7 @@
       <w:pPr>
         <w:keepLines/>
         <w:tabs>
-          <w:tab w:val="right" w:leader="dot" w:pos="9360"/>
+          <w:tab w:val="right" w:leader="dot" w:pos="9359"/>
         </w:tabs>
         <w:spacing w:before="96" w:after="0" w:line="276" w:lineRule="exact"/>
         <w:ind w:left="720" w:right="1120" w:hanging="720"/>
@@ -6284,7 +6284,7 @@
       <w:pPr>
         <w:keepLines/>
         <w:tabs>
-          <w:tab w:val="right" w:leader="dot" w:pos="9360"/>
+          <w:tab w:val="right" w:leader="dot" w:pos="9359"/>
         </w:tabs>
         <w:spacing w:before="96" w:after="0" w:line="276" w:lineRule="exact"/>
         <w:ind w:left="720" w:right="1120" w:hanging="720"/>
@@ -6318,7 +6318,7 @@
       <w:pPr>
         <w:keepLines/>
         <w:tabs>
-          <w:tab w:val="right" w:leader="dot" w:pos="9360"/>
+          <w:tab w:val="right" w:leader="dot" w:pos="9359"/>
         </w:tabs>
         <w:spacing w:before="96" w:after="0" w:line="276" w:lineRule="exact"/>
         <w:ind w:left="720" w:right="1200" w:hanging="720"/>
@@ -6346,7 +6346,7 @@
       <w:pPr>
         <w:keepLines/>
         <w:tabs>
-          <w:tab w:val="right" w:leader="dot" w:pos="9360"/>
+          <w:tab w:val="right" w:leader="dot" w:pos="9359"/>
         </w:tabs>
         <w:spacing w:before="96" w:after="0" w:line="276" w:lineRule="exact"/>
         <w:ind w:left="720" w:right="1120" w:hanging="720"/>
@@ -6374,7 +6374,7 @@
       <w:pPr>
         <w:keepLines/>
         <w:tabs>
-          <w:tab w:val="right" w:leader="dot" w:pos="9360"/>
+          <w:tab w:val="right" w:leader="dot" w:pos="9359"/>
         </w:tabs>
         <w:spacing w:before="96" w:after="0" w:line="276" w:lineRule="exact"/>
         <w:ind w:left="720" w:right="1120" w:hanging="720"/>
@@ -6402,7 +6402,7 @@
       <w:pPr>
         <w:keepLines/>
         <w:tabs>
-          <w:tab w:val="right" w:leader="dot" w:pos="9360"/>
+          <w:tab w:val="right" w:leader="dot" w:pos="9359"/>
         </w:tabs>
         <w:spacing w:before="96" w:after="0" w:line="276" w:lineRule="exact"/>
         <w:ind w:left="720" w:right="1120" w:hanging="720"/>
@@ -6430,7 +6430,7 @@
       <w:pPr>
         <w:keepLines/>
         <w:tabs>
-          <w:tab w:val="right" w:leader="dot" w:pos="9360"/>
+          <w:tab w:val="right" w:leader="dot" w:pos="9359"/>
         </w:tabs>
         <w:spacing w:before="96" w:after="0" w:line="276" w:lineRule="exact"/>
         <w:ind w:left="720" w:right="1120" w:hanging="720"/>
@@ -6458,7 +6458,7 @@
       <w:pPr>
         <w:keepLines/>
         <w:tabs>
-          <w:tab w:val="right" w:leader="dot" w:pos="9360"/>
+          <w:tab w:val="right" w:leader="dot" w:pos="9359"/>
         </w:tabs>
         <w:spacing w:before="96" w:after="0" w:line="276" w:lineRule="exact"/>
         <w:ind w:left="720" w:right="1120" w:hanging="720"/>
@@ -6486,7 +6486,7 @@
       <w:pPr>
         <w:keepLines/>
         <w:tabs>
-          <w:tab w:val="right" w:leader="dot" w:pos="9360"/>
+          <w:tab w:val="right" w:leader="dot" w:pos="9359"/>
         </w:tabs>
         <w:spacing w:before="96" w:after="0" w:line="276" w:lineRule="exact"/>
         <w:ind w:left="720" w:right="1120" w:hanging="720"/>
@@ -6514,7 +6514,7 @@
       <w:pPr>
         <w:keepLines/>
         <w:tabs>
-          <w:tab w:val="right" w:leader="dot" w:pos="9360"/>
+          <w:tab w:val="right" w:leader="dot" w:pos="9359"/>
         </w:tabs>
         <w:spacing w:before="96" w:after="0" w:line="276" w:lineRule="exact"/>
         <w:ind w:left="720" w:right="1120" w:hanging="720"/>
@@ -6560,7 +6560,7 @@
       <w:pPr>
         <w:keepLines/>
         <w:tabs>
-          <w:tab w:val="right" w:leader="dot" w:pos="9360"/>
+          <w:tab w:val="right" w:leader="dot" w:pos="9359"/>
         </w:tabs>
         <w:spacing w:before="96" w:after="0" w:line="276" w:lineRule="exact"/>
         <w:ind w:left="720" w:right="1120" w:hanging="720"/>
@@ -6588,7 +6588,7 @@
       <w:pPr>
         <w:keepLines/>
         <w:tabs>
-          <w:tab w:val="right" w:leader="dot" w:pos="9360"/>
+          <w:tab w:val="right" w:leader="dot" w:pos="9359"/>
         </w:tabs>
         <w:spacing w:before="96" w:after="0" w:line="276" w:lineRule="exact"/>
         <w:ind w:left="720" w:right="1120" w:hanging="720"/>
@@ -6616,7 +6616,7 @@
       <w:pPr>
         <w:keepLines/>
         <w:tabs>
-          <w:tab w:val="right" w:leader="dot" w:pos="9360"/>
+          <w:tab w:val="right" w:leader="dot" w:pos="9359"/>
         </w:tabs>
         <w:spacing w:before="96" w:after="0" w:line="276" w:lineRule="exact"/>
         <w:ind w:left="720" w:right="1120" w:hanging="720"/>
@@ -6644,7 +6644,7 @@
       <w:pPr>
         <w:keepLines/>
         <w:tabs>
-          <w:tab w:val="right" w:leader="dot" w:pos="9360"/>
+          <w:tab w:val="right" w:leader="dot" w:pos="9359"/>
         </w:tabs>
         <w:spacing w:before="96" w:after="0" w:line="276" w:lineRule="exact"/>
         <w:ind w:left="720" w:right="1120" w:hanging="720"/>
@@ -6672,7 +6672,7 @@
       <w:pPr>
         <w:keepLines/>
         <w:tabs>
-          <w:tab w:val="right" w:leader="dot" w:pos="9360"/>
+          <w:tab w:val="right" w:leader="dot" w:pos="9359"/>
         </w:tabs>
         <w:spacing w:before="96" w:after="0" w:line="276" w:lineRule="exact"/>
         <w:ind w:left="720" w:right="1120" w:hanging="720"/>
@@ -6700,7 +6700,7 @@
       <w:pPr>
         <w:keepLines/>
         <w:tabs>
-          <w:tab w:val="right" w:leader="dot" w:pos="9360"/>
+          <w:tab w:val="right" w:leader="dot" w:pos="9359"/>
         </w:tabs>
         <w:spacing w:before="96" w:after="0" w:line="276" w:lineRule="exact"/>
         <w:ind w:left="720" w:right="1120" w:hanging="720"/>
@@ -6728,7 +6728,7 @@
       <w:pPr>
         <w:keepLines/>
         <w:tabs>
-          <w:tab w:val="right" w:leader="dot" w:pos="9360"/>
+          <w:tab w:val="right" w:leader="dot" w:pos="9359"/>
         </w:tabs>
         <w:spacing w:before="96" w:after="0" w:line="276" w:lineRule="exact"/>
         <w:ind w:left="720" w:right="1120" w:hanging="720"/>
@@ -6786,7 +6786,7 @@
       <w:pPr>
         <w:keepLines/>
         <w:tabs>
-          <w:tab w:val="right" w:leader="dot" w:pos="9360"/>
+          <w:tab w:val="right" w:leader="dot" w:pos="9359"/>
         </w:tabs>
         <w:spacing w:before="96" w:after="0" w:line="276" w:lineRule="exact"/>
         <w:ind w:left="720" w:right="1120" w:hanging="720"/>
@@ -7040,7 +7040,7 @@
       <w:pPr>
         <w:keepLines/>
         <w:tabs>
-          <w:tab w:val="right" w:leader="dot" w:pos="9360"/>
+          <w:tab w:val="right" w:leader="dot" w:pos="9359"/>
         </w:tabs>
         <w:spacing w:before="96" w:after="0" w:line="276" w:lineRule="exact"/>
         <w:ind w:left="720" w:right="1120" w:hanging="720"/>
@@ -7070,7 +7070,7 @@
         <w:sectPr>
           <w:footerReference w:type="default" r:id="rIdXdPage"/>
           <w:pgSz w:w="12240" w:h="15840"/>
-          <w:pgMar w:top="1440" w:right="1440" w:bottom="1440" w:left="1440" w:header="720" w:footer="732" w:gutter="0"/>
+          <w:pgMar w:top="1440" w:right="1441" w:bottom="1440" w:left="1440" w:header="720" w:footer="732" w:gutter="0"/>
           <w:pgNumType w:fmt="lowerRoman" w:start="1"/>
         </w:sectPr>
       </w:pPr>
@@ -13992,7 +13992,7 @@
     </w:p>
     <w:tbl>
       <w:tblPr>
-        <w:tblW w:w="9360" w:type="dxa"/>
+        <w:tblW w:w="9359" w:type="dxa"/>
         <w:tblLayout w:type="fixed"/>
         <w:tblCellMar>
           <w:top w:w="0" w:type="dxa"/>
@@ -14003,7 +14003,7 @@
         <w:tblLook w:val="0000" w:firstRow="0" w:lastRow="0" w:firstColumn="0" w:lastColumn="0" w:noHBand="0" w:noVBand="0"/>
       </w:tblPr>
       <w:tblGrid>
-        <w:gridCol w:w="9360"/>
+        <w:gridCol w:w="9359"/>
       </w:tblGrid>
       <w:tr>
         <w:trPr>
@@ -14011,7 +14011,7 @@
         </w:trPr>
         <w:tc>
           <w:tcPr>
-            <w:tcW w:w="9360" w:type="dxa"/>
+            <w:tcW w:w="9359" w:type="dxa"/>
           </w:tcPr>
           <w:p>
             <w:pPr>
@@ -15285,7 +15285,7 @@
     <w:sectPr>
       <w:footerReference w:type="default" r:id="rIdXdPage"/>
       <w:pgSz w:w="12240" w:h="15840"/>
-      <w:pgMar w:top="1440" w:right="1440" w:bottom="1440" w:left="1440" w:header="720" w:footer="732" w:gutter="0"/>
+      <w:pgMar w:top="1440" w:right="1441" w:bottom="1440" w:left="1440" w:header="720" w:footer="732" w:gutter="0"/>
       <w:pgNumType w:fmt="decimal" w:start="1"/>
     </w:sectPr>
   </w:body>

</xml_diff>